<commit_message>
Add global audit logging, permission sync audits
Centralize and expand auditing across the app: add global model event listeners and auth event listeners in EventServiceProvider to record create/update/delete, login, logout and failed login events (with ip/user agent). Add logGlobalAudit helper to normalize payloads. Record permission sync operations in RoleController (store/update). Disable the model-level Auditable boot to avoid duplicate logs. Update auditorias views (index and pdf) to show new action types and resource types. Also update user manuals (HTML/MD/DOCX) to include admin and auditing/control modules documentation.
</commit_message>
<xml_diff>
--- a/MANUAL_USUARIO.docx
+++ b/MANUAL_USUARIO.docx
@@ -1709,6 +1709,740 @@
       </w:pPr>
       <w:r>
         <w:t>3.  Actualiza los campos necesarios y confirma los cambios. La solución se actualizará sin modificar el estatus del ticket cerrado.</w:t>
+      </w:r>
+    </w:p>
+    <w:p>
+      <w:pPr>
+        <w:spacing w:after="160" w:line="276" w:lineRule="auto"/>
+      </w:pPr>
+      <w:r>
+        <w:t>---</w:t>
+      </w:r>
+    </w:p>
+    <w:p>
+      <w:pPr>
+        <w:pStyle w:val="Heading2"/>
+        <w:keepNext/>
+        <w:spacing w:before="360" w:after="160"/>
+      </w:pPr>
+      <w:r>
+        <w:rPr>
+          <w:rFonts w:ascii="Arial" w:hAnsi="Arial"/>
+          <w:b/>
+          <w:color w:val="475569"/>
+          <w:sz w:val="28"/>
+        </w:rPr>
+        <w:t>6. MANUAL DEL ADMINISTRADOR GLOBAL (SÚPER USUARIO)</w:t>
+      </w:r>
+    </w:p>
+    <w:p>
+      <w:pPr>
+        <w:spacing w:after="160" w:line="276" w:lineRule="auto"/>
+      </w:pPr>
+      <w:r>
+        <w:t>El Administrador tiene el control total sobre la seguridad, los accesos y la configuración del sistema.</w:t>
+      </w:r>
+    </w:p>
+    <w:p>
+      <w:pPr>
+        <w:pStyle w:val="Heading3"/>
+        <w:keepNext/>
+        <w:spacing w:before="360" w:after="160"/>
+      </w:pPr>
+      <w:r>
+        <w:rPr>
+          <w:rFonts w:ascii="Arial" w:hAnsi="Arial"/>
+          <w:b/>
+          <w:color w:val="0F172A"/>
+          <w:sz w:val="24"/>
+        </w:rPr>
+        <w:t>A. Bandeja de Aprobaciones (Nuevos Registros)</w:t>
+      </w:r>
+    </w:p>
+    <w:p>
+      <w:pPr>
+        <w:spacing w:after="160" w:line="276" w:lineRule="auto"/>
+      </w:pPr>
+      <w:r>
+        <w:t xml:space="preserve">Por motivos de seguridad, cuando un colaborador nuevo se registra en el Helpdesk, su cuenta entra a una </w:t>
+      </w:r>
+      <w:r>
+        <w:rPr>
+          <w:b/>
+        </w:rPr>
+        <w:t>Sala de Espera</w:t>
+      </w:r>
+      <w:r>
+        <w:t>. No podrá crear tickets ni ver el panel hasta que sea validado.</w:t>
+      </w:r>
+    </w:p>
+    <w:p>
+      <w:pPr>
+        <w:spacing w:after="160" w:line="276" w:lineRule="auto"/>
+      </w:pPr>
+      <w:r>
+        <w:t xml:space="preserve">1. Ingresa a la sección </w:t>
+      </w:r>
+      <w:r>
+        <w:rPr>
+          <w:b/>
+        </w:rPr>
+        <w:t>Aprobación de Usuarios</w:t>
+      </w:r>
+      <w:r>
+        <w:t xml:space="preserve"> en el menú lateral.</w:t>
+      </w:r>
+    </w:p>
+    <w:p>
+      <w:pPr>
+        <w:spacing w:after="160" w:line="276" w:lineRule="auto"/>
+      </w:pPr>
+      <w:r>
+        <w:t>2. Verás una lista de usuarios "Pendientes" con la ruta organizacional que declararon al registrarse (ej. Sede Central &gt; División de Tecnología).</w:t>
+      </w:r>
+    </w:p>
+    <w:p>
+      <w:pPr>
+        <w:spacing w:after="160" w:line="276" w:lineRule="auto"/>
+      </w:pPr>
+      <w:r>
+        <w:t xml:space="preserve">3. Evalúa si los datos son legítimos y haz clic en </w:t>
+      </w:r>
+      <w:r>
+        <w:rPr>
+          <w:b/>
+        </w:rPr>
+        <w:t>Aprobar Acceso</w:t>
+      </w:r>
+      <w:r>
+        <w:t xml:space="preserve">. En caso de un registro erróneo o fraudulento, puedes </w:t>
+      </w:r>
+      <w:r>
+        <w:rPr>
+          <w:b/>
+        </w:rPr>
+        <w:t>Rechazar</w:t>
+      </w:r>
+      <w:r>
+        <w:t>.</w:t>
+      </w:r>
+    </w:p>
+    <w:p>
+      <w:pPr>
+        <w:pStyle w:val="Heading3"/>
+        <w:keepNext/>
+        <w:spacing w:before="360" w:after="160"/>
+      </w:pPr>
+      <w:r>
+        <w:rPr>
+          <w:rFonts w:ascii="Arial" w:hAnsi="Arial"/>
+          <w:b/>
+          <w:color w:val="0F172A"/>
+          <w:sz w:val="24"/>
+        </w:rPr>
+        <w:t>B. Directorio Dinámico de Usuarios</w:t>
+      </w:r>
+    </w:p>
+    <w:p>
+      <w:pPr>
+        <w:spacing w:after="160" w:line="276" w:lineRule="auto"/>
+      </w:pPr>
+      <w:r>
+        <w:t xml:space="preserve">Desde la sección </w:t>
+      </w:r>
+      <w:r>
+        <w:rPr>
+          <w:b/>
+        </w:rPr>
+        <w:t>Usuarios</w:t>
+      </w:r>
+      <w:r>
+        <w:t xml:space="preserve"> (Bajo *Configuración y Activos*), puedes administrar a toda la plantilla del sistema.</w:t>
+      </w:r>
+    </w:p>
+    <w:p>
+      <w:pPr>
+        <w:pStyle w:val="ListBullet"/>
+        <w:spacing w:after="80"/>
+        <w:ind w:left="720"/>
+      </w:pPr>
+      <w:r/>
+      <w:r>
+        <w:rPr>
+          <w:b/>
+        </w:rPr>
+        <w:t>Buscador Rápido</w:t>
+      </w:r>
+      <w:r>
+        <w:t>: Utiliza la barra de búsqueda superior para encontrar inmediatamente a un colaborador tecleando su nombre, correo o número de cédula. La tabla se filtrará instantáneamente.</w:t>
+      </w:r>
+    </w:p>
+    <w:p>
+      <w:pPr>
+        <w:pStyle w:val="ListBullet"/>
+        <w:spacing w:after="80"/>
+        <w:ind w:left="720"/>
+      </w:pPr>
+      <w:r/>
+      <w:r>
+        <w:rPr>
+          <w:b/>
+        </w:rPr>
+        <w:t>Cambiar Roles (Privilegios)</w:t>
+      </w:r>
+      <w:r>
+        <w:t>: Al hacer clic en el botón de edición (el lápiz azul) junto al rol actual de un usuario, puedes ascenderlo o reasignarlo. *Ejemplo: Convertir a un 'usuario' en 'técnico'.*</w:t>
+      </w:r>
+    </w:p>
+    <w:p>
+      <w:pPr>
+        <w:pStyle w:val="ListBullet"/>
+        <w:spacing w:after="80"/>
+        <w:ind w:left="720"/>
+      </w:pPr>
+      <w:r/>
+      <w:r>
+        <w:rPr>
+          <w:b/>
+        </w:rPr>
+        <w:t>Interruptor de Acceso (Activar/Desactivar)</w:t>
+      </w:r>
+      <w:r>
+        <w:t>: En la columna "Acceso", puedes apagar el interruptor azul para desactivar a un usuario instantáneamente (por ejemplo, por despido o suspensión). El sistema expulsará al usuario inmediatamente y no le permitirá iniciar sesión hasta que vuelvas a encender el interruptor.</w:t>
+      </w:r>
+    </w:p>
+    <w:p>
+      <w:pPr>
+        <w:pStyle w:val="Heading3"/>
+        <w:keepNext/>
+        <w:spacing w:before="360" w:after="160"/>
+      </w:pPr>
+      <w:r>
+        <w:rPr>
+          <w:rFonts w:ascii="Arial" w:hAnsi="Arial"/>
+          <w:b/>
+          <w:color w:val="0F172A"/>
+          <w:sz w:val="24"/>
+        </w:rPr>
+        <w:t>C. Catálogo de Activos de Hardware</w:t>
+      </w:r>
+    </w:p>
+    <w:p>
+      <w:pPr>
+        <w:spacing w:after="160" w:line="276" w:lineRule="auto"/>
+      </w:pPr>
+      <w:r>
+        <w:t xml:space="preserve">Desde el menú </w:t>
+      </w:r>
+      <w:r>
+        <w:rPr>
+          <w:b/>
+        </w:rPr>
+        <w:t>Catálogo de Activos</w:t>
+      </w:r>
+      <w:r>
+        <w:t>, los gestores y administradores pueden organizar el inventario lógico de hardware del sistema a través de tres pestañas operativas:</w:t>
+      </w:r>
+    </w:p>
+    <w:p>
+      <w:pPr>
+        <w:spacing w:after="160" w:line="276" w:lineRule="auto"/>
+      </w:pPr>
+      <w:r>
+        <w:t xml:space="preserve">1.  </w:t>
+      </w:r>
+      <w:r>
+        <w:rPr>
+          <w:b/>
+        </w:rPr>
+        <w:t>Tipos de Equipos</w:t>
+      </w:r>
+      <w:r>
+        <w:t>: Categorización base del hardware (Ej: Laptops, Desktops, Impresoras, Tarjetas Gráficas).</w:t>
+      </w:r>
+    </w:p>
+    <w:p>
+      <w:pPr>
+        <w:spacing w:after="160" w:line="276" w:lineRule="auto"/>
+      </w:pPr>
+      <w:r>
+        <w:t xml:space="preserve">2.  </w:t>
+      </w:r>
+      <w:r>
+        <w:rPr>
+          <w:b/>
+        </w:rPr>
+        <w:t>Fabricantes / Marcas</w:t>
+      </w:r>
+      <w:r>
+        <w:t>: Marcas del hardware, vinculadas opcionalmente a un tipo de equipo compatible (Ej: *NVIDIA* como fabricante asociado a *Tarjeta Gráfica*).</w:t>
+      </w:r>
+    </w:p>
+    <w:p>
+      <w:pPr>
+        <w:spacing w:after="160" w:line="276" w:lineRule="auto"/>
+      </w:pPr>
+      <w:r>
+        <w:t xml:space="preserve">3.  </w:t>
+      </w:r>
+      <w:r>
+        <w:rPr>
+          <w:b/>
+        </w:rPr>
+        <w:t>Modelos</w:t>
+      </w:r>
+      <w:r>
+        <w:t>: Línea de producto específica vinculada a una marca (Ej: *GeForce RTX 4070*).</w:t>
+      </w:r>
+    </w:p>
+    <w:p>
+      <w:pPr>
+        <w:pStyle w:val="ListBullet"/>
+        <w:spacing w:after="80"/>
+        <w:ind w:left="720"/>
+      </w:pPr>
+      <w:r/>
+      <w:r>
+        <w:rPr>
+          <w:b/>
+        </w:rPr>
+        <w:t>Buscadores y Paginación</w:t>
+      </w:r>
+      <w:r>
+        <w:t>: Cada una de las pestañas cuenta con su propia barra de búsqueda y paginador para manejar listados de forma ágil.</w:t>
+      </w:r>
+    </w:p>
+    <w:p>
+      <w:pPr>
+        <w:pStyle w:val="ListBullet"/>
+        <w:spacing w:after="80"/>
+        <w:ind w:left="720"/>
+      </w:pPr>
+      <w:r/>
+      <w:r>
+        <w:rPr>
+          <w:b/>
+        </w:rPr>
+        <w:t>Smart Deletes (Eliminación Inteligente)</w:t>
+      </w:r>
+      <w:r>
+        <w:t>: Para proteger la integridad de tus datos, el sistema no te permitirá eliminar un tipo de equipo si tiene marcas o modelos asignados, ni una marca si tiene modelos activos en uso.</w:t>
+      </w:r>
+    </w:p>
+    <w:p>
+      <w:pPr>
+        <w:spacing w:after="160" w:line="276" w:lineRule="auto"/>
+      </w:pPr>
+      <w:r>
+        <w:t>---</w:t>
+      </w:r>
+    </w:p>
+    <w:p>
+      <w:pPr>
+        <w:pStyle w:val="Heading2"/>
+        <w:keepNext/>
+        <w:spacing w:before="360" w:after="160"/>
+      </w:pPr>
+      <w:r>
+        <w:rPr>
+          <w:rFonts w:ascii="Arial" w:hAnsi="Arial"/>
+          <w:b/>
+          <w:color w:val="475569"/>
+          <w:sz w:val="28"/>
+        </w:rPr>
+        <w:t>7. MÓDULOS DE CONTROL INTERNO Y AUDITORÍA (GESTORES Y ADMINISTRADORES)</w:t>
+      </w:r>
+    </w:p>
+    <w:p>
+      <w:pPr>
+        <w:spacing w:after="160" w:line="276" w:lineRule="auto"/>
+      </w:pPr>
+      <w:r>
+        <w:t>Para garantizar la seguridad lógica, transparencia del sistema y el control de la productividad, se incorporaron tres paneles avanzados:</w:t>
+      </w:r>
+    </w:p>
+    <w:p>
+      <w:pPr>
+        <w:pStyle w:val="Heading3"/>
+        <w:keepNext/>
+        <w:spacing w:before="360" w:after="160"/>
+      </w:pPr>
+      <w:r>
+        <w:rPr>
+          <w:rFonts w:ascii="Arial" w:hAnsi="Arial"/>
+          <w:b/>
+          <w:color w:val="0F172A"/>
+          <w:sz w:val="24"/>
+        </w:rPr>
+        <w:t>A. Preservación del Historial de Categorías en Tickets</w:t>
+      </w:r>
+    </w:p>
+    <w:p>
+      <w:pPr>
+        <w:spacing w:after="160" w:line="276" w:lineRule="auto"/>
+      </w:pPr>
+      <w:r>
+        <w:t xml:space="preserve">Si editas el nombre de una categoría o la desactivas, los tickets antiguos </w:t>
+      </w:r>
+      <w:r>
+        <w:rPr>
+          <w:b/>
+        </w:rPr>
+        <w:t>nunca verán alterada su información</w:t>
+      </w:r>
+      <w:r>
+        <w:t>. Cada ticket congela permanentemente el nombre de la categoría asignada al crearse, lo que asegura reportes e historiales consistentes a través del tiempo.</w:t>
+      </w:r>
+    </w:p>
+    <w:p>
+      <w:pPr>
+        <w:pStyle w:val="Heading3"/>
+        <w:keepNext/>
+        <w:spacing w:before="360" w:after="160"/>
+      </w:pPr>
+      <w:r>
+        <w:rPr>
+          <w:rFonts w:ascii="Arial" w:hAnsi="Arial"/>
+          <w:b/>
+          <w:color w:val="0F172A"/>
+          <w:sz w:val="24"/>
+        </w:rPr>
+        <w:t>B. Bitácora de Auditorías (Logs de Actividades)</w:t>
+      </w:r>
+    </w:p>
+    <w:p>
+      <w:pPr>
+        <w:spacing w:after="160" w:line="276" w:lineRule="auto"/>
+      </w:pPr>
+      <w:r>
+        <w:t xml:space="preserve">Ubicada en </w:t>
+      </w:r>
+      <w:r>
+        <w:rPr>
+          <w:b/>
+        </w:rPr>
+        <w:t>Bitácora de Auditorías</w:t>
+      </w:r>
+      <w:r>
+        <w:t xml:space="preserve"> en el menú lateral, esta interfaz permite monitorear todos los movimientos del sistema en tiempo real:</w:t>
+      </w:r>
+    </w:p>
+    <w:p>
+      <w:pPr>
+        <w:pStyle w:val="ListBullet"/>
+        <w:spacing w:after="80"/>
+        <w:ind w:left="720"/>
+      </w:pPr>
+      <w:r/>
+      <w:r>
+        <w:rPr>
+          <w:b/>
+        </w:rPr>
+        <w:t>¿Qué registra?</w:t>
+      </w:r>
+      <w:r>
+        <w:t>:</w:t>
+      </w:r>
+    </w:p>
+    <w:p>
+      <w:pPr>
+        <w:pStyle w:val="ListBullet"/>
+        <w:spacing w:after="80"/>
+        <w:ind w:left="720"/>
+      </w:pPr>
+      <w:r>
+        <w:t>Inicios de sesión (</w:t>
+      </w:r>
+      <w:r>
+        <w:rPr>
+          <w:rFonts w:ascii="Courier New" w:hAnsi="Courier New"/>
+          <w:color w:val="0D6EFD"/>
+          <w:sz w:val="19"/>
+        </w:rPr>
+        <w:t>login</w:t>
+      </w:r>
+      <w:r>
+        <w:t>) y salidas (</w:t>
+      </w:r>
+      <w:r>
+        <w:rPr>
+          <w:rFonts w:ascii="Courier New" w:hAnsi="Courier New"/>
+          <w:color w:val="0D6EFD"/>
+          <w:sz w:val="19"/>
+        </w:rPr>
+        <w:t>logout</w:t>
+      </w:r>
+      <w:r>
+        <w:t>) del sistema.</w:t>
+      </w:r>
+    </w:p>
+    <w:p>
+      <w:pPr>
+        <w:pStyle w:val="ListBullet"/>
+        <w:spacing w:after="80"/>
+        <w:ind w:left="720"/>
+      </w:pPr>
+      <w:r>
+        <w:t>Intentos de accesos fallidos (</w:t>
+      </w:r>
+      <w:r>
+        <w:rPr>
+          <w:rFonts w:ascii="Courier New" w:hAnsi="Courier New"/>
+          <w:color w:val="0D6EFD"/>
+          <w:sz w:val="19"/>
+        </w:rPr>
+        <w:t>login_failed</w:t>
+      </w:r>
+      <w:r>
+        <w:t>) para alertar sobre actividad sospechosa.</w:t>
+      </w:r>
+    </w:p>
+    <w:p>
+      <w:pPr>
+        <w:pStyle w:val="ListBullet"/>
+        <w:spacing w:after="80"/>
+        <w:ind w:left="720"/>
+      </w:pPr>
+      <w:r>
+        <w:t>Sincronización de permisos sobre roles de seguridad.</w:t>
+      </w:r>
+    </w:p>
+    <w:p>
+      <w:pPr>
+        <w:pStyle w:val="ListBullet"/>
+        <w:spacing w:after="80"/>
+        <w:ind w:left="720"/>
+      </w:pPr>
+      <w:r>
+        <w:t>Creaciones, modificaciones y eliminaciones de cualquier elemento del catálogo.</w:t>
+      </w:r>
+    </w:p>
+    <w:p>
+      <w:pPr>
+        <w:pStyle w:val="ListBullet"/>
+        <w:spacing w:after="80"/>
+        <w:ind w:left="720"/>
+      </w:pPr>
+      <w:r/>
+      <w:r>
+        <w:rPr>
+          <w:b/>
+        </w:rPr>
+        <w:t>Detalles JSON de Cambios</w:t>
+      </w:r>
+      <w:r>
+        <w:t>: Puedes expandir cada registro para ver con exactitud los datos anteriores (</w:t>
+      </w:r>
+      <w:r>
+        <w:rPr>
+          <w:rFonts w:ascii="Courier New" w:hAnsi="Courier New"/>
+          <w:color w:val="0D6EFD"/>
+          <w:sz w:val="19"/>
+        </w:rPr>
+        <w:t>old_values</w:t>
+      </w:r>
+      <w:r>
+        <w:t>) y los datos nuevos (</w:t>
+      </w:r>
+      <w:r>
+        <w:rPr>
+          <w:rFonts w:ascii="Courier New" w:hAnsi="Courier New"/>
+          <w:color w:val="0D6EFD"/>
+          <w:sz w:val="19"/>
+        </w:rPr>
+        <w:t>new_values</w:t>
+      </w:r>
+      <w:r>
+        <w:t>) en formato legible.</w:t>
+      </w:r>
+    </w:p>
+    <w:p>
+      <w:pPr>
+        <w:pStyle w:val="ListBullet"/>
+        <w:spacing w:after="80"/>
+        <w:ind w:left="720"/>
+      </w:pPr>
+      <w:r/>
+      <w:r>
+        <w:rPr>
+          <w:b/>
+        </w:rPr>
+        <w:t>Filtros de Búsqueda</w:t>
+      </w:r>
+      <w:r>
+        <w:t>: Filtra logs por tipo de acción, componente afectado o responsable de la acción.</w:t>
+      </w:r>
+    </w:p>
+    <w:p>
+      <w:pPr>
+        <w:pStyle w:val="ListBullet"/>
+        <w:spacing w:after="80"/>
+        <w:ind w:left="720"/>
+      </w:pPr>
+      <w:r/>
+      <w:r>
+        <w:rPr>
+          <w:b/>
+        </w:rPr>
+        <w:t>Exportar Reportes</w:t>
+      </w:r>
+      <w:r>
+        <w:t>: Cuenta con dos botones principales debajo del título de la bitácora:</w:t>
+      </w:r>
+    </w:p>
+    <w:p>
+      <w:pPr>
+        <w:pStyle w:val="ListBullet"/>
+        <w:spacing w:after="80"/>
+        <w:ind w:left="720"/>
+      </w:pPr>
+      <w:r/>
+      <w:r>
+        <w:rPr>
+          <w:b/>
+        </w:rPr>
+        <w:t>Excel (CSV)</w:t>
+      </w:r>
+      <w:r>
+        <w:t>: Descarga un reporte completo en formato compatible con hojas de cálculo.</w:t>
+      </w:r>
+    </w:p>
+    <w:p>
+      <w:pPr>
+        <w:pStyle w:val="ListBullet"/>
+        <w:spacing w:after="80"/>
+        <w:ind w:left="720"/>
+      </w:pPr>
+      <w:r/>
+      <w:r>
+        <w:rPr>
+          <w:b/>
+        </w:rPr>
+        <w:t>Descargar PDF</w:t>
+      </w:r>
+      <w:r>
+        <w:t>: Genera un documento PDF formal, limpio y en formato horizontal para revisiones de control interno.</w:t>
+      </w:r>
+    </w:p>
+    <w:p>
+      <w:pPr>
+        <w:pStyle w:val="ListBullet"/>
+        <w:spacing w:after="80"/>
+        <w:ind w:left="720"/>
+      </w:pPr>
+      <w:r>
+        <w:t>*Nota: Ambas exportaciones respetan automáticamente los filtros de búsqueda que tengas aplicados en pantalla.*</w:t>
+      </w:r>
+    </w:p>
+    <w:p>
+      <w:pPr>
+        <w:pStyle w:val="Heading3"/>
+        <w:keepNext/>
+        <w:spacing w:before="360" w:after="160"/>
+      </w:pPr>
+      <w:r>
+        <w:rPr>
+          <w:rFonts w:ascii="Arial" w:hAnsi="Arial"/>
+          <w:b/>
+          <w:color w:val="0F172A"/>
+          <w:sz w:val="24"/>
+        </w:rPr>
+        <w:t>C. Módulo de Rendimiento Técnico (KPIs de Productividad)</w:t>
+      </w:r>
+    </w:p>
+    <w:p>
+      <w:pPr>
+        <w:spacing w:after="160" w:line="276" w:lineRule="auto"/>
+      </w:pPr>
+      <w:r>
+        <w:t xml:space="preserve">Accediendo a </w:t>
+      </w:r>
+      <w:r>
+        <w:rPr>
+          <w:b/>
+        </w:rPr>
+        <w:t>Rendimiento Técnico</w:t>
+      </w:r>
+      <w:r>
+        <w:t>, los supervisores pueden monitorear el desempeño del equipo de soporte de forma gráfica e interactiva:</w:t>
+      </w:r>
+    </w:p>
+    <w:p>
+      <w:pPr>
+        <w:pStyle w:val="ListBullet"/>
+        <w:spacing w:after="80"/>
+        <w:ind w:left="720"/>
+      </w:pPr>
+      <w:r/>
+      <w:r>
+        <w:rPr>
+          <w:b/>
+        </w:rPr>
+        <w:t>Tarjetas de KPIs Globales</w:t>
+      </w:r>
+      <w:r>
+        <w:t>: Muestra la cantidad total de tickets en el sistema, resueltos, en proceso y la tasa de resolución global de la organización.</w:t>
+      </w:r>
+    </w:p>
+    <w:p>
+      <w:pPr>
+        <w:pStyle w:val="ListBullet"/>
+        <w:spacing w:after="80"/>
+        <w:ind w:left="720"/>
+      </w:pPr>
+      <w:r/>
+      <w:r>
+        <w:rPr>
+          <w:b/>
+        </w:rPr>
+        <w:t>Métricas por Especialista</w:t>
+      </w:r>
+      <w:r>
+        <w:t>: Muestra la productividad individual de cada técnico:</w:t>
+      </w:r>
+    </w:p>
+    <w:p>
+      <w:pPr>
+        <w:pStyle w:val="ListBullet"/>
+        <w:spacing w:after="80"/>
+        <w:ind w:left="720"/>
+      </w:pPr>
+      <w:r>
+        <w:t>Cantidad de tickets asignados, activos y resueltos.</w:t>
+      </w:r>
+    </w:p>
+    <w:p>
+      <w:pPr>
+        <w:pStyle w:val="ListBullet"/>
+        <w:spacing w:after="80"/>
+        <w:ind w:left="720"/>
+      </w:pPr>
+      <w:r/>
+      <w:r>
+        <w:rPr>
+          <w:b/>
+        </w:rPr>
+        <w:t>Tasa de Cierre (Barra de progreso)</w:t>
+      </w:r>
+      <w:r>
+        <w:t>: Porcentaje de casos solucionados.</w:t>
+      </w:r>
+    </w:p>
+    <w:p>
+      <w:pPr>
+        <w:pStyle w:val="ListBullet"/>
+        <w:spacing w:after="80"/>
+        <w:ind w:left="720"/>
+      </w:pPr>
+      <w:r/>
+      <w:r>
+        <w:rPr>
+          <w:b/>
+        </w:rPr>
+        <w:t>Tiempo Promedio de Cierre</w:t>
+      </w:r>
+      <w:r>
+        <w:t>: Horas de respuesta promedio calculadas automáticamente desde el momento de la asignación del ticket hasta su resolución técnica en el spooler.</w:t>
       </w:r>
     </w:p>
     <w:p>
@@ -1788,7 +2522,16 @@
               <w:t>Técnicos</w:t>
             </w:r>
             <w:r>
-              <w:t>: Utilicen las Notas Internas para debatir problemas con los gestores antes de dar una respuesta formal al cliente final.</w:t>
+              <w:t xml:space="preserve">: Utilicen las Notas Internas para debatir problemas con los gestores antes de dar una respuesta formal al cliente final. *   </w:t>
+            </w:r>
+            <w:r>
+              <w:rPr>
+                <w:b/>
+              </w:rPr>
+              <w:t>Administradores</w:t>
+            </w:r>
+            <w:r>
+              <w:t>: Revisen la bandeja de aprobaciones diariamente para no bloquear el flujo de trabajo de nuevos ingresos.</w:t>
             </w:r>
           </w:p>
         </w:tc>

</xml_diff>